<commit_message>
docs: actualizar documentacion general, arquitectura y eliminar archivos obsoletos
</commit_message>
<xml_diff>
--- a/InclusiON.Documents/Parcial_AdmProyectos_InclusiON.docx
+++ b/InclusiON.Documents/Parcial_AdmProyectos_InclusiON.docx
@@ -1477,7 +1477,7 @@
                 <w:sz w:val="22"/>
                 <w:szCs w:val="22"/>
               </w:rPr>
-              <w:t xml:space="preserve">React.js (Frontend) / ASP.NET Web API en C# (Backend) / Microsoft SQL Server (Base de datos) / REST API con JSON</w:t>
+              <w:t xml:space="preserve">Angular (Frontend) / ASP.NET Web API en C# (Backend) / PostgreSQL 17 en contenedor Docker con pgvector (Base de datos) / REST API con JSON</w:t>
             </w:r>
           </w:p>
         </w:tc>
@@ -10292,7 +10292,7 @@
                 <w:sz w:val="22"/>
                 <w:szCs w:val="22"/>
               </w:rPr>
-              <w:t xml:space="preserve">Diagrama entidad-relación (DER) conceptual y modelo físico SQL Server con todas las tablas, atributos, relaciones, claves primarias y foráneas del dominio del sistema.</w:t>
+              <w:t xml:space="preserve">Diagrama entidad-relación (DER) conceptual y modelo físico relacional PostgreSQL 17 en contenedor Docker con pgvector con todas las tablas, atributos, relaciones, claves primarias y foráneas del dominio del sistema.</w:t>
             </w:r>
           </w:p>
         </w:tc>

</xml_diff>